<commit_message>
Add 5 viva Q&A per practical and attractive printable PDFs for all 15
- Added "viva" key to every practical in PRACTICALS (5 exam-style
  questions with detailed answers per practical, specific to each topic)
- build_docx(): renders a "Viva Questions" section after Result/Conclusion
  with bold Q# headings and indented answers
- PDF builder refactored: coloured section headings (dark blue), shaded
  code blocks (#f4f4f4 grey), green-tinted output blocks (#eaf4ea),
  yellow-tinted viva question rows, HRFlowable dividers — print-ready
- main() now generates individual PDFs for all 15 practicals
  (Practical_NN.pdf) plus a full combined PDF (Practicals_All_Combined.pdf)
  in addition to the existing Practicals_01-05_Combined.pdf

Co-Authored-By: Claude Sonnet 4.6 <noreply@anthropic.com>
Claude-Session: https://claude.ai/code/session_01AFrW7MbD51AV1js86146xr
</commit_message>
<xml_diff>
--- a/Practical_01/Practical_01.docx
+++ b/Practical_01/Practical_01.docx
@@ -115,7 +115,7 @@
       <w:r>
         <w:rPr>
           <w:rFonts w:ascii="Consolas" w:hAnsi="Consolas"/>
-          <w:sz w:val="20"/>
+          <w:sz w:val="19"/>
         </w:rPr>
         <w:t>stack = []</w:t>
         <w:br/>
@@ -175,7 +175,7 @@
       <w:r>
         <w:rPr>
           <w:rFonts w:ascii="Consolas" w:hAnsi="Consolas"/>
-          <w:sz w:val="20"/>
+          <w:sz w:val="19"/>
         </w:rPr>
         <w:t>Stack: [10, 20, 30]</w:t>
         <w:br/>
@@ -199,6 +199,94 @@
     <w:p>
       <w:r>
         <w:t>The stack, queue, and linked list data structures were successfully implemented and their basic operations (push/pop, enqueue/dequeue, traversal) were verified.</w:t>
+      </w:r>
+    </w:p>
+    <w:p>
+      <w:pPr>
+        <w:pStyle w:val="Heading2"/>
+      </w:pPr>
+      <w:r>
+        <w:t>Viva Questions</w:t>
+      </w:r>
+    </w:p>
+    <w:p>
+      <w:r>
+        <w:rPr>
+          <w:b/>
+        </w:rPr>
+        <w:t>Q1. What is the difference between a Stack and a Queue?</w:t>
+      </w:r>
+    </w:p>
+    <w:p>
+      <w:pPr>
+        <w:ind w:left="360"/>
+      </w:pPr>
+      <w:r>
+        <w:t>Ans: A Stack follows LIFO (Last In First Out) — the last element inserted is the first to be removed (like a pile of plates). A Queue follows FIFO (First In First Out) — the first element inserted is the first to be removed (like a ticket line). Stack operations are push/pop at the top; Queue operations are enqueue at the rear and dequeue from the front.</w:t>
+      </w:r>
+    </w:p>
+    <w:p>
+      <w:r>
+        <w:rPr>
+          <w:b/>
+        </w:rPr>
+        <w:t>Q2. Why is collections.deque preferred over a list for implementing a Queue in Python?</w:t>
+      </w:r>
+    </w:p>
+    <w:p>
+      <w:pPr>
+        <w:ind w:left="360"/>
+      </w:pPr>
+      <w:r>
+        <w:t>Ans: list.pop(0) (dequeue from the front) is O(n) because all remaining elements must be shifted one position left. collections.deque is backed by a doubly linked list and provides O(1) popleft() and append(), making it the correct choice for FIFO queues where both ends are accessed.</w:t>
+      </w:r>
+    </w:p>
+    <w:p>
+      <w:r>
+        <w:rPr>
+          <w:b/>
+        </w:rPr>
+        <w:t>Q3. What is a node in a Linked List, and what does it contain?</w:t>
+      </w:r>
+    </w:p>
+    <w:p>
+      <w:pPr>
+        <w:ind w:left="360"/>
+      </w:pPr>
+      <w:r>
+        <w:t>Ans: A node is the basic unit of a linked list. It contains two parts: the data field (the actual value stored) and the next field (a reference/pointer to the next node in the sequence). The last node's next field is None, marking the end of the list.</w:t>
+      </w:r>
+    </w:p>
+    <w:p>
+      <w:r>
+        <w:rPr>
+          <w:b/>
+        </w:rPr>
+        <w:t>Q4. What is the time complexity of push and pop operations on a Stack?</w:t>
+      </w:r>
+    </w:p>
+    <w:p>
+      <w:pPr>
+        <w:ind w:left="360"/>
+      </w:pPr>
+      <w:r>
+        <w:t>Ans: Both push (append to end) and pop (remove from end) on a Python list-based stack are O(1) amortised time, because Python lists use dynamic arrays with amortised constant-time appends and direct index access at the last position.</w:t>
+      </w:r>
+    </w:p>
+    <w:p>
+      <w:r>
+        <w:rPr>
+          <w:b/>
+        </w:rPr>
+        <w:t>Q5. What are the real-world applications of a Stack?</w:t>
+      </w:r>
+    </w:p>
+    <w:p>
+      <w:pPr>
+        <w:ind w:left="360"/>
+      </w:pPr>
+      <w:r>
+        <w:t>Ans: Stacks are used in: (1) function call management — the call stack tracks active function frames; (2) expression evaluation and conversion (infix to postfix); (3) undo/redo mechanisms in text editors; (4) backtracking algorithms (maze solving, DFS); (5) browser history (back button).</w:t>
       </w:r>
     </w:p>
     <w:sectPr>

</xml_diff>